<commit_message>
Added initial version number: v1.0.0-beta
</commit_message>
<xml_diff>
--- a/docs/GettingStartedGuide.docx
+++ b/docs/GettingStartedGuide.docx
@@ -7,7 +7,16 @@
         <w:pStyle w:val="Heading1"/>
       </w:pPr>
       <w:r>
-        <w:t xml:space="preserve">BeebPerf </w:t>
+        <w:t>BeebPerf</w:t>
+      </w:r>
+      <w:r>
+        <w:t xml:space="preserve"> – v</w:t>
+      </w:r>
+      <w:r>
+        <w:t xml:space="preserve">ersion </w:t>
+      </w:r>
+      <w:r>
+        <w:t>1.0.0-beta</w:t>
       </w:r>
     </w:p>
     <w:p>
@@ -747,7 +756,15 @@
           </w:tcPr>
           <w:p>
             <w:r>
-              <w:t>The total CPU cycle count spent servicing interrupts.</w:t>
+              <w:t xml:space="preserve">The total CPU cycle count </w:t>
+            </w:r>
+            <w:proofErr w:type="gramStart"/>
+            <w:r>
+              <w:t>spent</w:t>
+            </w:r>
+            <w:proofErr w:type="gramEnd"/>
+            <w:r>
+              <w:t xml:space="preserve"> servicing interrupts.</w:t>
             </w:r>
           </w:p>
           <w:p>
@@ -863,7 +880,15 @@
           </w:tcPr>
           <w:p>
             <w:r>
-              <w:t>These columns are shown when a routine is selected within the Memory Tab’s right-hand panel.  The columns show the number of times the instruction read or wrote to the selected address.</w:t>
+              <w:t xml:space="preserve">These columns are shown when a routine is selected within the Memory Tab’s right-hand panel.  The columns show the number of times the </w:t>
+            </w:r>
+            <w:proofErr w:type="gramStart"/>
+            <w:r>
+              <w:t>instruction</w:t>
+            </w:r>
+            <w:proofErr w:type="gramEnd"/>
+            <w:r>
+              <w:t xml:space="preserve"> read or wrote to the selected address.</w:t>
             </w:r>
           </w:p>
         </w:tc>
@@ -1005,7 +1030,23 @@
           <w:rFonts w:ascii="Aptos" w:hAnsi="Aptos"/>
           <w:color w:val="000000"/>
         </w:rPr>
-        <w:t xml:space="preserve">The profiler treats tail-calls and fall-throughs as routine calls: jumps or branches to another routine are marked as tail calls, and falling through to the next routine is also </w:t>
+        <w:t xml:space="preserve">The profiler treats tail-calls and fall-throughs as routine </w:t>
+      </w:r>
+      <w:proofErr w:type="gramStart"/>
+      <w:r>
+        <w:rPr>
+          <w:rFonts w:ascii="Aptos" w:hAnsi="Aptos"/>
+          <w:color w:val="000000"/>
+        </w:rPr>
+        <w:t>calls:</w:t>
+      </w:r>
+      <w:proofErr w:type="gramEnd"/>
+      <w:r>
+        <w:rPr>
+          <w:rFonts w:ascii="Aptos" w:hAnsi="Aptos"/>
+          <w:color w:val="000000"/>
+        </w:rPr>
+        <w:t xml:space="preserve"> jumps or branches to another routine are marked as tail calls, and falling through to the next routine is also </w:t>
       </w:r>
       <w:r>
         <w:rPr>

</xml_diff>